<commit_message>
Audit fixes: YouTube tags article
Co-Authored-By: Claude Opus 5.5 <noreply@anthropic.com>
Claude-Session: https://claude.ai/code/session_01GQXcnZLn4f9MkUS7SEqp5J
</commit_message>
<xml_diff>
--- a/blog-content/YouTube-Tags.docx
+++ b/blog-content/YouTube-Tags.docx
@@ -153,7 +153,7 @@
         </w:rPr>
         <w:t xml:space="preserve">YouTube has answered the question itself, in its own help pages. This guide starts there, then covers how to add tags on a computer, on mobile and on Shorts, how many to use, whether tag generators and extractors are worth it, and where your keywords should go instead. It's part of our </w:t>
       </w:r>
-      <w:hyperlink w:history="1" r:id="rIdycrtmuopu6wrz2qoakdt5">
+      <w:hyperlink w:history="1" r:id="rIdtxfhetdqrfub9sh7g1mbu">
         <w:r>
           <w:rPr>
             <w:rStyle w:val="Hyperlink"/>
@@ -235,7 +235,7 @@
         <w:shd w:fill="F0ECFF" w:val="clear"/>
         <w:spacing w:after="160"/>
       </w:pPr>
-      <w:hyperlink w:history="1" r:id="rIdv_ebnnce2ieptcpj_wgik">
+      <w:hyperlink w:history="1" r:id="rIdr696ee4-ro7tpcgmmef5p">
         <w:r>
           <w:rPr>
             <w:rStyle w:val="Hyperlink"/>
@@ -264,7 +264,7 @@
         </w:rPr>
         <w:t xml:space="preserve">YouTube's upload help describes the Tags field the same way: "descriptive keywords to help correct search mistakes" (</w:t>
       </w:r>
-      <w:hyperlink w:history="1" r:id="rIdu4vyetywbpffvat5q_wn0">
+      <w:hyperlink w:history="1" r:id="rIdg9jbeqzqkfeyeiqev4nwo">
         <w:r>
           <w:rPr>
             <w:rStyle w:val="Hyperlink"/>
@@ -285,6 +285,42 @@
           <w:szCs w:val="24"/>
         </w:rPr>
         <w:t xml:space="preserve">).</w:t>
+      </w:r>
+    </w:p>
+    <w:p>
+      <w:pPr>
+        <w:spacing w:after="160"/>
+      </w:pPr>
+      <w:r>
+        <w:rPr>
+          <w:rFonts w:ascii="Calibri" w:cs="Calibri" w:eastAsia="Calibri" w:hAnsi="Calibri"/>
+          <w:color w:val="333333"/>
+          <w:sz w:val="24"/>
+          <w:szCs w:val="24"/>
+        </w:rPr>
+        <w:t xml:space="preserve">Creators who have tested this report the same thing. Social Video Plaza uploaded videos with and without tags and found that </w:t>
+      </w:r>
+      <w:hyperlink w:history="1" r:id="rIdtg3igbghhvdxznjysyw2t">
+        <w:r>
+          <w:rPr>
+            <w:rStyle w:val="Hyperlink"/>
+            <w:rFonts w:ascii="Calibri" w:cs="Calibri" w:eastAsia="Calibri" w:hAnsi="Calibri"/>
+            <w:color w:val="0563C1"/>
+            <w:sz w:val="24"/>
+            <w:szCs w:val="24"/>
+            <w:u w:val="single"/>
+          </w:rPr>
+          <w:t xml:space="preserve">a video without tags didn't "fall flat on its face"</w:t>
+        </w:r>
+      </w:hyperlink>
+      <w:r>
+        <w:rPr>
+          <w:rFonts w:ascii="Calibri" w:cs="Calibri" w:eastAsia="Calibri" w:hAnsi="Calibri"/>
+          <w:color w:val="333333"/>
+          <w:sz w:val="24"/>
+          <w:szCs w:val="24"/>
+        </w:rPr>
+        <w:t xml:space="preserve">; it was one small channel's test, but it matches what YouTube says.</w:t>
       </w:r>
     </w:p>
     <w:p>
@@ -1158,7 +1194,7 @@
           <w:sz w:val="24"/>
           <w:szCs w:val="24"/>
         </w:rPr>
-        <w:t xml:space="preserve">Then add your main topic phrase, the same words that are already in your title. Five to ten tags covering these cases is plenty for most videos.</w:t>
+        <w:t xml:space="preserve">Then add your main topic phrase, the same words that are already in your title.</w:t>
       </w:r>
     </w:p>
     <w:p>
@@ -1326,7 +1362,7 @@
           <w:sz w:val="24"/>
           <w:szCs w:val="24"/>
         </w:rPr>
-        <w:t xml:space="preserve">Tags play a "minimal role"</w:t>
+        <w:t xml:space="preserve">Tags carry little weight</w:t>
       </w:r>
       <w:r>
         <w:rPr>
@@ -1810,7 +1846,7 @@
                 <w:sz w:val="24"/>
                 <w:szCs w:val="24"/>
               </w:rPr>
-              <w:t xml:space="preserve">"Minimal role" in discovery</w:t>
+              <w:t xml:space="preserve">Small role, mainly for misspellings</w:t>
             </w:r>
           </w:p>
         </w:tc>
@@ -1862,7 +1898,7 @@
         </w:rPr>
         <w:t xml:space="preserve">According to </w:t>
       </w:r>
-      <w:hyperlink w:history="1" r:id="rIdntvo5ud10si-3riyhh7fs">
+      <w:hyperlink w:history="1" r:id="rIdahkwiet86-9g6ljwwgher">
         <w:r>
           <w:rPr>
             <w:rStyle w:val="Hyperlink"/>
@@ -1915,7 +1951,7 @@
         </w:rPr>
         <w:t xml:space="preserve">Put your main keywords in the title, the first lines of the description and the words you say in the video. YouTube's description tips recommend identifying </w:t>
       </w:r>
-      <w:hyperlink w:history="1" r:id="rIdmgpy07dzs8c5-gsayi0w_">
+      <w:hyperlink w:history="1" r:id="rIdonuko08pz0drliktkd_q2">
         <w:r>
           <w:rPr>
             <w:rStyle w:val="Hyperlink"/>
@@ -1988,7 +2024,7 @@
         </w:rPr>
         <w:t xml:space="preserve"> Put the phrase viewers search for near the start. Our guide to </w:t>
       </w:r>
-      <w:hyperlink w:history="1" r:id="rIdbbdd56bkvutq060oud8d9">
+      <w:hyperlink w:history="1" r:id="rIdoruoz0zbwfeolgo2xhnpj">
         <w:r>
           <w:rPr>
             <w:rStyle w:val="Hyperlink"/>
@@ -2741,7 +2777,7 @@
         </w:rPr>
         <w:t xml:space="preserve">Only if the video serves viewers in that language. A better option for reaching other languages is YouTube's translation feature for titles and descriptions, which </w:t>
       </w:r>
-      <w:hyperlink w:history="1" r:id="rId3lslnnnn_veporj2cuka9">
+      <w:hyperlink w:history="1" r:id="rIdpzxleu10djd6kdd2i1wxb">
         <w:r>
           <w:rPr>
             <w:rStyle w:val="Hyperlink"/>
@@ -2823,7 +2859,7 @@
           <w:sz w:val="24"/>
           <w:szCs w:val="24"/>
         </w:rPr>
-        <w:t xml:space="preserve">YouTube doesn't publish a timeframe, and because tags play a minimal role, you're unlikely to see a measurable change from tags alone. If you want to test a change, adjust the title or description and compare views from YouTube search in Analytics over the next few weeks.</w:t>
+        <w:t xml:space="preserve">YouTube doesn't publish a timeframe, and because tags count for so little, you're unlikely to see a measurable change from tags alone. If you want to test a change, adjust the title or description and compare views from YouTube search in Analytics over the next few weeks.</w:t>
       </w:r>
     </w:p>
     <w:p>

</xml_diff>